<commit_message>
added first meeting protocol
</commit_message>
<xml_diff>
--- a/meetings/19700101 Template.docx
+++ b/meetings/19700101 Template.docx
@@ -4,7 +4,821 @@
   <w:body>
     <w:tbl>
       <w:tblPr>
-        <w:tblStyle w:val="TableGrid"/>
+        <w:tblStyle w:val="Tabellenraster"/>
+        <w:tblW w:w="0" w:type="auto"/>
+        <w:tblLook w:val="04A0" w:firstRow="1" w:lastRow="0" w:firstColumn="1" w:lastColumn="0" w:noHBand="0" w:noVBand="1"/>
+      </w:tblPr>
+      <w:tblGrid>
+        <w:gridCol w:w="4508"/>
+        <w:gridCol w:w="4508"/>
+      </w:tblGrid>
+      <w:tr>
+        <w:tc>
+          <w:tcPr>
+            <w:tcW w:w="4508" w:type="dxa"/>
+          </w:tcPr>
+          <w:p>
+            <w:r>
+              <w:rPr>
+                <w:lang/>
+              </w:rPr>
+              <w:t>Meeting Date</w:t>
+            </w:r>
+          </w:p>
+        </w:tc>
+        <w:tc>
+          <w:tcPr>
+            <w:tcW w:w="4508" w:type="dxa"/>
+          </w:tcPr>
+          <w:p>
+            <w:r>
+              <w:t>09.03.2026</w:t>
+            </w:r>
+          </w:p>
+        </w:tc>
+      </w:tr>
+      <w:tr>
+        <w:tc>
+          <w:tcPr>
+            <w:tcW w:w="4508" w:type="dxa"/>
+          </w:tcPr>
+          <w:p>
+            <w:pPr>
+              <w:rPr>
+                <w:lang/>
+              </w:rPr>
+            </w:pPr>
+            <w:r>
+              <w:rPr>
+                <w:lang/>
+              </w:rPr>
+              <w:t>Begin Time</w:t>
+            </w:r>
+          </w:p>
+        </w:tc>
+        <w:tc>
+          <w:tcPr>
+            <w:tcW w:w="4508" w:type="dxa"/>
+          </w:tcPr>
+          <w:p>
+            <w:r>
+              <w:rPr>
+                <w:lang/>
+              </w:rPr>
+              <w:t>11:30</w:t>
+            </w:r>
+          </w:p>
+        </w:tc>
+      </w:tr>
+      <w:tr>
+        <w:tc>
+          <w:tcPr>
+            <w:tcW w:w="4508" w:type="dxa"/>
+          </w:tcPr>
+          <w:p>
+            <w:pPr>
+              <w:rPr>
+                <w:lang/>
+              </w:rPr>
+            </w:pPr>
+            <w:r>
+              <w:rPr>
+                <w:lang/>
+              </w:rPr>
+              <w:t>End Time</w:t>
+            </w:r>
+          </w:p>
+        </w:tc>
+        <w:tc>
+          <w:tcPr>
+            <w:tcW w:w="4508" w:type="dxa"/>
+          </w:tcPr>
+          <w:p>
+            <w:r>
+              <w:rPr>
+                <w:lang/>
+              </w:rPr>
+              <w:t>12:</w:t>
+            </w:r>
+            <w:r>
+              <w:rPr>
+                <w:lang/>
+              </w:rPr>
+              <w:t>45</w:t>
+            </w:r>
+          </w:p>
+        </w:tc>
+      </w:tr>
+      <w:tr>
+        <w:tc>
+          <w:tcPr>
+            <w:tcW w:w="4508" w:type="dxa"/>
+          </w:tcPr>
+          <w:p>
+            <w:pPr>
+              <w:rPr>
+                <w:lang/>
+              </w:rPr>
+            </w:pPr>
+            <w:r>
+              <w:rPr>
+                <w:lang/>
+              </w:rPr>
+              <w:t>Attended People</w:t>
+            </w:r>
+          </w:p>
+        </w:tc>
+        <w:tc>
+          <w:tcPr>
+            <w:tcW w:w="4508" w:type="dxa"/>
+          </w:tcPr>
+          <w:p>
+            <w:pPr>
+              <w:rPr>
+                <w:lang/>
+              </w:rPr>
+            </w:pPr>
+            <w:r>
+              <w:rPr>
+                <w:lang/>
+              </w:rPr>
+              <w:t>Hörmansdorfer Moritz</w:t>
+            </w:r>
+            <w:r>
+              <w:rPr>
+                <w:lang/>
+              </w:rPr>
+              <w:t>,</w:t>
+            </w:r>
+            <w:r>
+              <w:rPr>
+                <w:lang/>
+              </w:rPr>
+              <w:t xml:space="preserve"> Salnikow Nina</w:t>
+            </w:r>
+            <w:r>
+              <w:rPr>
+                <w:lang/>
+              </w:rPr>
+              <w:t>,</w:t>
+            </w:r>
+            <w:r>
+              <w:rPr>
+                <w:lang/>
+              </w:rPr>
+              <w:t xml:space="preserve"> Oberhumer Dominik</w:t>
+            </w:r>
+            <w:r>
+              <w:rPr>
+                <w:lang/>
+              </w:rPr>
+              <w:t>,</w:t>
+            </w:r>
+            <w:r>
+              <w:rPr>
+                <w:lang/>
+              </w:rPr>
+              <w:t xml:space="preserve"> Klasov</w:t>
+            </w:r>
+            <w:r>
+              <w:rPr>
+                <w:rFonts w:ascii="Aptos" w:hAnsi="Aptos" w:cs="Aptos"/>
+                <w:lang/>
+              </w:rPr>
+              <w:t>á</w:t>
+            </w:r>
+            <w:r>
+              <w:rPr>
+                <w:lang/>
+              </w:rPr>
+              <w:t xml:space="preserve"> Sara</w:t>
+            </w:r>
+            <w:r>
+              <w:rPr>
+                <w:lang/>
+              </w:rPr>
+              <w:t xml:space="preserve">, </w:t>
+            </w:r>
+            <w:r>
+              <w:rPr>
+                <w:lang/>
+              </w:rPr>
+              <w:t>Kavita Surana</w:t>
+            </w:r>
+          </w:p>
+        </w:tc>
+      </w:tr>
+    </w:tbl>
+    <w:p>
+      <w:pPr>
+        <w:rPr>
+          <w:lang/>
+        </w:rPr>
+      </w:pPr>
+    </w:p>
+    <w:p>
+      <w:pPr>
+        <w:pStyle w:val="berschrift1"/>
+        <w:rPr>
+          <w:lang/>
+        </w:rPr>
+      </w:pPr>
+      <w:r>
+        <w:rPr>
+          <w:lang/>
+        </w:rPr>
+        <w:t>Discussed Topics</w:t>
+      </w:r>
+    </w:p>
+    <w:p>
+      <w:pPr>
+        <w:rPr>
+          <w:lang/>
+        </w:rPr>
+      </w:pPr>
+      <w:r>
+        <w:rPr>
+          <w:lang/>
+        </w:rPr>
+        <w:t xml:space="preserve">11:30: </w:t>
+      </w:r>
+      <w:r>
+        <w:rPr>
+          <w:lang w:val="en-US"/>
+        </w:rPr>
+        <w:t>m</w:t>
+      </w:r>
+      <w:r>
+        <w:rPr>
+          <w:lang/>
+        </w:rPr>
+        <w:t xml:space="preserve">eeting with </w:t>
+      </w:r>
+      <w:r>
+        <w:rPr>
+          <w:lang w:val="en-US"/>
+        </w:rPr>
+        <w:t xml:space="preserve">our </w:t>
+      </w:r>
+      <w:r>
+        <w:rPr>
+          <w:lang/>
+        </w:rPr>
+        <w:t>superv</w:t>
+      </w:r>
+      <w:r>
+        <w:rPr>
+          <w:lang w:val="en-US"/>
+        </w:rPr>
+        <w:t>s</w:t>
+      </w:r>
+      <w:r>
+        <w:rPr>
+          <w:lang/>
+        </w:rPr>
+        <w:t>ior</w:t>
+      </w:r>
+      <w:r>
+        <w:rPr>
+          <w:lang w:val="en-US"/>
+        </w:rPr>
+        <w:t xml:space="preserve"> </w:t>
+      </w:r>
+      <w:r>
+        <w:rPr>
+          <w:lang w:val="en-US"/>
+        </w:rPr>
+        <w:t>Kavita Surana</w:t>
+      </w:r>
+      <w:r>
+        <w:rPr>
+          <w:lang/>
+        </w:rPr>
+        <w:t xml:space="preserve">: </w:t>
+      </w:r>
+    </w:p>
+    <w:p>
+      <w:pPr>
+        <w:pStyle w:val="Listenabsatz"/>
+        <w:numPr>
+          <w:ilvl w:val="0"/>
+          <w:numId w:val="5"/>
+        </w:numPr>
+        <w:rPr>
+          <w:lang w:val="en-US"/>
+        </w:rPr>
+      </w:pPr>
+      <w:r>
+        <w:rPr>
+          <w:lang w:val="en-US"/>
+        </w:rPr>
+        <w:t>S</w:t>
+      </w:r>
+      <w:r>
+        <w:rPr>
+          <w:lang w:val="en-US"/>
+        </w:rPr>
+        <w:t xml:space="preserve">upervisor </w:t>
+      </w:r>
+      <w:r>
+        <w:rPr>
+          <w:lang w:val="en-US"/>
+        </w:rPr>
+        <w:t>gave us an introduction to the project</w:t>
+      </w:r>
+    </w:p>
+    <w:p>
+      <w:pPr>
+        <w:pStyle w:val="Listenabsatz"/>
+        <w:numPr>
+          <w:ilvl w:val="0"/>
+          <w:numId w:val="5"/>
+        </w:numPr>
+        <w:rPr>
+          <w:lang w:val="en-US"/>
+        </w:rPr>
+      </w:pPr>
+      <w:r>
+        <w:rPr>
+          <w:lang w:val="en-US"/>
+        </w:rPr>
+        <w:t xml:space="preserve"> </w:t>
+      </w:r>
+      <w:r>
+        <w:rPr>
+          <w:lang w:val="en-US"/>
+        </w:rPr>
+        <w:t xml:space="preserve">And </w:t>
+      </w:r>
+      <w:r>
+        <w:rPr>
+          <w:lang w:val="en-US"/>
+        </w:rPr>
+        <w:t xml:space="preserve">connected us with the </w:t>
+      </w:r>
+      <w:r>
+        <w:rPr>
+          <w:lang w:val="en-US"/>
+        </w:rPr>
+        <w:t>d</w:t>
+      </w:r>
+      <w:r>
+        <w:rPr>
+          <w:lang w:val="en-US"/>
+        </w:rPr>
+        <w:t xml:space="preserve">ata </w:t>
+      </w:r>
+      <w:r>
+        <w:rPr>
+          <w:lang w:val="en-US"/>
+        </w:rPr>
+        <w:t>c</w:t>
+      </w:r>
+      <w:r>
+        <w:rPr>
+          <w:lang w:val="en-US"/>
+        </w:rPr>
+        <w:t>oaches</w:t>
+      </w:r>
+    </w:p>
+    <w:p>
+      <w:pPr>
+        <w:rPr>
+          <w:lang/>
+        </w:rPr>
+      </w:pPr>
+      <w:r>
+        <w:rPr>
+          <w:lang/>
+        </w:rPr>
+        <w:t xml:space="preserve">12:00: </w:t>
+      </w:r>
+      <w:r>
+        <w:rPr>
+          <w:lang w:val="en-US"/>
+        </w:rPr>
+        <w:t>m</w:t>
+      </w:r>
+      <w:r>
+        <w:rPr>
+          <w:lang/>
+        </w:rPr>
+        <w:t>eeting only with 4 Group members:</w:t>
+      </w:r>
+    </w:p>
+    <w:p>
+      <w:pPr>
+        <w:pStyle w:val="Listenabsatz"/>
+        <w:numPr>
+          <w:ilvl w:val="0"/>
+          <w:numId w:val="6"/>
+        </w:numPr>
+        <w:rPr>
+          <w:lang w:val="en-US"/>
+        </w:rPr>
+      </w:pPr>
+      <w:r>
+        <w:rPr>
+          <w:lang w:val="en-US"/>
+        </w:rPr>
+        <w:t xml:space="preserve"> </w:t>
+      </w:r>
+      <w:r>
+        <w:rPr>
+          <w:lang w:val="en-US"/>
+        </w:rPr>
+        <w:t>We a</w:t>
+      </w:r>
+      <w:r>
+        <w:rPr>
+          <w:lang w:val="en-US"/>
+        </w:rPr>
+        <w:t xml:space="preserve">greed to meet every </w:t>
+      </w:r>
+      <w:r>
+        <w:rPr>
+          <w:lang w:val="en-US"/>
+        </w:rPr>
+        <w:t>T</w:t>
+      </w:r>
+      <w:r>
+        <w:rPr>
+          <w:lang w:val="en-US"/>
+        </w:rPr>
+        <w:t>hursday</w:t>
+      </w:r>
+      <w:r>
+        <w:rPr>
+          <w:lang w:val="en-US"/>
+        </w:rPr>
+        <w:t xml:space="preserve"> at</w:t>
+      </w:r>
+      <w:r>
+        <w:rPr>
+          <w:lang w:val="en-US"/>
+        </w:rPr>
+        <w:t xml:space="preserve"> 7pm</w:t>
+      </w:r>
+    </w:p>
+    <w:p>
+      <w:pPr>
+        <w:pStyle w:val="Listenabsatz"/>
+        <w:numPr>
+          <w:ilvl w:val="0"/>
+          <w:numId w:val="6"/>
+        </w:numPr>
+        <w:rPr>
+          <w:lang w:val="en-US"/>
+        </w:rPr>
+      </w:pPr>
+      <w:r>
+        <w:rPr>
+          <w:lang w:val="en-US"/>
+        </w:rPr>
+        <w:t xml:space="preserve"> </w:t>
+      </w:r>
+      <w:r>
+        <w:rPr>
+          <w:lang w:val="en-US"/>
+        </w:rPr>
+        <w:t>And de</w:t>
+      </w:r>
+      <w:r>
+        <w:rPr>
+          <w:lang w:val="en-US"/>
+        </w:rPr>
+        <w:t>cided to use GitHub and Microsoft Teams for collaboration</w:t>
+      </w:r>
+    </w:p>
+    <w:p>
+      <w:pPr>
+        <w:pStyle w:val="berschrift1"/>
+        <w:rPr>
+          <w:lang/>
+        </w:rPr>
+      </w:pPr>
+      <w:r>
+        <w:rPr>
+          <w:lang/>
+        </w:rPr>
+        <w:t>Follow Up</w:t>
+      </w:r>
+    </w:p>
+    <w:p>
+      <w:pPr>
+        <w:pStyle w:val="Listenabsatz"/>
+        <w:numPr>
+          <w:ilvl w:val="0"/>
+          <w:numId w:val="4"/>
+        </w:numPr>
+        <w:rPr>
+          <w:lang w:val="en-US"/>
+        </w:rPr>
+      </w:pPr>
+      <w:r>
+        <w:rPr>
+          <w:lang w:val="en-US"/>
+        </w:rPr>
+        <w:t>Dominik will write an email to the data coaches.</w:t>
+      </w:r>
+    </w:p>
+    <w:p>
+      <w:pPr>
+        <w:pStyle w:val="Listenabsatz"/>
+        <w:numPr>
+          <w:ilvl w:val="0"/>
+          <w:numId w:val="4"/>
+        </w:numPr>
+        <w:rPr>
+          <w:lang w:val="en-US"/>
+        </w:rPr>
+      </w:pPr>
+      <w:r>
+        <w:rPr>
+          <w:lang w:val="en-US"/>
+        </w:rPr>
+        <w:t>Nina will finalize the meeting notes and push them to GitHub.</w:t>
+      </w:r>
+    </w:p>
+    <w:p>
+      <w:pPr>
+        <w:pStyle w:val="Listenabsatz"/>
+        <w:numPr>
+          <w:ilvl w:val="0"/>
+          <w:numId w:val="4"/>
+        </w:numPr>
+        <w:rPr>
+          <w:lang w:val="en-US"/>
+        </w:rPr>
+      </w:pPr>
+      <w:r>
+        <w:rPr>
+          <w:lang w:val="en-US"/>
+        </w:rPr>
+        <w:t xml:space="preserve">We will all </w:t>
+      </w:r>
+      <w:r>
+        <w:rPr>
+          <w:lang w:val="en-US"/>
+        </w:rPr>
+        <w:t>familiarize ourselves with the topic and the potential “problems”</w:t>
+      </w:r>
+    </w:p>
+    <w:p>
+      <w:pPr>
+        <w:pStyle w:val="Listenabsatz"/>
+        <w:numPr>
+          <w:ilvl w:val="0"/>
+          <w:numId w:val="4"/>
+        </w:numPr>
+        <w:rPr>
+          <w:lang w:val="en-US"/>
+        </w:rPr>
+      </w:pPr>
+      <w:r>
+        <w:rPr>
+          <w:lang w:val="en-US"/>
+        </w:rPr>
+        <w:t xml:space="preserve">We will prepare </w:t>
+      </w:r>
+      <w:r>
+        <w:rPr>
+          <w:lang w:val="en-US"/>
+        </w:rPr>
+        <w:t>more</w:t>
+      </w:r>
+      <w:r>
+        <w:rPr>
+          <w:lang w:val="en-US"/>
+        </w:rPr>
+        <w:t xml:space="preserve"> questions for the data coaches</w:t>
+      </w:r>
+      <w:r>
+        <w:rPr>
+          <w:lang w:val="en-US"/>
+        </w:rPr>
+        <w:t xml:space="preserve"> meeting</w:t>
+      </w:r>
+      <w:r>
+        <w:rPr>
+          <w:lang w:val="en-US"/>
+        </w:rPr>
+        <w:t>:</w:t>
+      </w:r>
+    </w:p>
+    <w:p>
+      <w:pPr>
+        <w:pStyle w:val="Listenabsatz"/>
+        <w:rPr>
+          <w:lang w:val="en-US"/>
+        </w:rPr>
+      </w:pPr>
+    </w:p>
+    <w:p>
+      <w:pPr>
+        <w:pStyle w:val="Listenabsatz"/>
+        <w:rPr>
+          <w:u w:val="single"/>
+          <w:lang w:val="en-US"/>
+        </w:rPr>
+      </w:pPr>
+      <w:r>
+        <w:rPr>
+          <w:u w:val="single"/>
+          <w:lang w:val="en-US"/>
+        </w:rPr>
+        <w:t>Current Questions</w:t>
+      </w:r>
+      <w:r>
+        <w:rPr>
+          <w:u w:val="single"/>
+          <w:lang w:val="en-US"/>
+        </w:rPr>
+        <w:t xml:space="preserve"> Nina defined</w:t>
+      </w:r>
+      <w:r>
+        <w:rPr>
+          <w:u w:val="single"/>
+          <w:lang w:val="en-US"/>
+        </w:rPr>
+        <w:t>:</w:t>
+      </w:r>
+    </w:p>
+    <w:p>
+      <w:pPr>
+        <w:pStyle w:val="Listenabsatz"/>
+        <w:rPr>
+          <w:lang w:val="en-US"/>
+        </w:rPr>
+      </w:pPr>
+      <w:r>
+        <w:rPr>
+          <w:lang w:val="en-US"/>
+        </w:rPr>
+        <w:t xml:space="preserve">How often </w:t>
+      </w:r>
+      <w:r>
+        <w:rPr>
+          <w:lang w:val="en-US"/>
+        </w:rPr>
+        <w:t>should</w:t>
+      </w:r>
+      <w:r>
+        <w:rPr>
+          <w:lang w:val="en-US"/>
+        </w:rPr>
+        <w:t xml:space="preserve"> we meet, and when? </w:t>
+      </w:r>
+    </w:p>
+    <w:p>
+      <w:pPr>
+        <w:pStyle w:val="Listenabsatz"/>
+        <w:rPr>
+          <w:lang w:val="en-US"/>
+        </w:rPr>
+      </w:pPr>
+      <w:r>
+        <w:rPr>
+          <w:lang w:val="en-US"/>
+        </w:rPr>
+        <w:t>Should we use WU Cloud</w:t>
+      </w:r>
+      <w:r>
+        <w:rPr>
+          <w:lang w:val="en-US"/>
+        </w:rPr>
+        <w:t>/Cluster</w:t>
+      </w:r>
+      <w:r>
+        <w:rPr>
+          <w:lang w:val="en-US"/>
+        </w:rPr>
+        <w:t xml:space="preserve"> or are there alternative options? </w:t>
+      </w:r>
+    </w:p>
+    <w:p>
+      <w:pPr>
+        <w:pStyle w:val="Listenabsatz"/>
+        <w:rPr>
+          <w:lang w:val="en-US"/>
+        </w:rPr>
+      </w:pPr>
+      <w:r>
+        <w:rPr>
+          <w:lang w:val="en-US"/>
+        </w:rPr>
+        <w:t xml:space="preserve">What exactly do they want from the project? </w:t>
+      </w:r>
+    </w:p>
+    <w:p>
+      <w:pPr>
+        <w:pStyle w:val="Listenabsatz"/>
+        <w:rPr>
+          <w:lang w:val="en-US"/>
+        </w:rPr>
+      </w:pPr>
+      <w:r>
+        <w:rPr>
+          <w:lang w:val="en-US"/>
+        </w:rPr>
+        <w:t>What problem are we expected to solve?</w:t>
+      </w:r>
+    </w:p>
+    <w:p>
+      <w:pPr>
+        <w:pStyle w:val="berschrift1"/>
+        <w:rPr>
+          <w:lang/>
+        </w:rPr>
+      </w:pPr>
+      <w:r>
+        <w:rPr>
+          <w:lang/>
+        </w:rPr>
+        <w:t>Emergencies</w:t>
+      </w:r>
+    </w:p>
+    <w:p>
+      <w:pPr>
+        <w:rPr>
+          <w:lang w:val="en-US"/>
+        </w:rPr>
+      </w:pPr>
+      <w:r>
+        <w:rPr>
+          <w:lang w:val="en-US"/>
+        </w:rPr>
+        <w:t xml:space="preserve">Inform </w:t>
+      </w:r>
+      <w:r>
+        <w:rPr>
+          <w:lang w:val="en-US"/>
+        </w:rPr>
+        <w:t>a</w:t>
+      </w:r>
+      <w:r>
+        <w:rPr>
+          <w:lang w:val="en-US"/>
+        </w:rPr>
+        <w:t>bout time conflicts:</w:t>
+      </w:r>
+    </w:p>
+    <w:p>
+      <w:pPr>
+        <w:rPr>
+          <w:lang w:val="en-US"/>
+        </w:rPr>
+      </w:pPr>
+      <w:r>
+        <w:rPr>
+          <w:lang w:val="en-US"/>
+        </w:rPr>
+        <w:t xml:space="preserve">23.April -&gt; Dominik </w:t>
+      </w:r>
+    </w:p>
+    <w:p>
+      <w:pPr>
+        <w:rPr>
+          <w:lang w:val="en-US"/>
+        </w:rPr>
+      </w:pPr>
+      <w:r>
+        <w:rPr>
+          <w:lang w:val="en-US"/>
+        </w:rPr>
+        <w:t>19.Juni -&gt; Nina</w:t>
+      </w:r>
+      <w:r>
+        <w:rPr>
+          <w:lang w:val="en-US"/>
+        </w:rPr>
+        <w:t>: got Linux exam from 9:30 to 12:00</w:t>
+      </w:r>
+    </w:p>
+    <w:p>
+      <w:pPr>
+        <w:rPr>
+          <w:lang w:val="en-US"/>
+        </w:rPr>
+      </w:pPr>
+    </w:p>
+    <w:p>
+      <w:pPr>
+        <w:rPr>
+          <w:lang w:val="en-US"/>
+        </w:rPr>
+      </w:pPr>
+    </w:p>
+    <w:p>
+      <w:pPr>
+        <w:rPr>
+          <w:lang w:val="en-US"/>
+        </w:rPr>
+      </w:pPr>
+    </w:p>
+    <w:tbl>
+      <w:tblPr>
+        <w:tblStyle w:val="Tabellenraster"/>
         <w:tblW w:w="0" w:type="auto"/>
         <w:tblLook w:val="04A0" w:firstRow="1" w:lastRow="0" w:firstColumn="1" w:lastColumn="0" w:noHBand="0" w:noVBand="1"/>
       </w:tblPr>
@@ -20,13 +834,14 @@
           <w:p>
             <w:pPr>
               <w:rPr>
-                <w:lang w:val="en-AT"/>
+                <w:lang/>
               </w:rPr>
             </w:pPr>
             <w:r>
               <w:rPr>
-                <w:lang w:val="en-AT"/>
-              </w:rPr>
+                <w:lang/>
+              </w:rPr>
+              <w:lastRenderedPageBreak/>
               <w:t>Meeting Date</w:t>
             </w:r>
           </w:p>
@@ -36,11 +851,9 @@
             <w:tcW w:w="4508" w:type="dxa"/>
           </w:tcPr>
           <w:p>
-            <w:pPr>
-              <w:rPr>
-                <w:lang w:val="en-AT"/>
-              </w:rPr>
-            </w:pPr>
+            <w:r>
+              <w:t>12.03</w:t>
+            </w:r>
           </w:p>
         </w:tc>
       </w:tr>
@@ -52,12 +865,12 @@
           <w:p>
             <w:pPr>
               <w:rPr>
-                <w:lang w:val="en-AT"/>
+                <w:lang/>
               </w:rPr>
             </w:pPr>
             <w:r>
               <w:rPr>
-                <w:lang w:val="en-AT"/>
+                <w:lang/>
               </w:rPr>
               <w:t>Begin Time</w:t>
             </w:r>
@@ -68,11 +881,9 @@
             <w:tcW w:w="4508" w:type="dxa"/>
           </w:tcPr>
           <w:p>
-            <w:pPr>
-              <w:rPr>
-                <w:lang w:val="en-AT"/>
-              </w:rPr>
-            </w:pPr>
+            <w:r>
+              <w:t>19:00</w:t>
+            </w:r>
           </w:p>
         </w:tc>
       </w:tr>
@@ -84,12 +895,12 @@
           <w:p>
             <w:pPr>
               <w:rPr>
-                <w:lang w:val="en-AT"/>
+                <w:lang/>
               </w:rPr>
             </w:pPr>
             <w:r>
               <w:rPr>
-                <w:lang w:val="en-AT"/>
+                <w:lang/>
               </w:rPr>
               <w:t>End Time</w:t>
             </w:r>
@@ -99,13 +910,7 @@
           <w:tcPr>
             <w:tcW w:w="4508" w:type="dxa"/>
           </w:tcPr>
-          <w:p>
-            <w:pPr>
-              <w:rPr>
-                <w:lang w:val="en-AT"/>
-              </w:rPr>
-            </w:pPr>
-          </w:p>
+          <w:p/>
         </w:tc>
       </w:tr>
       <w:tr>
@@ -116,12 +921,12 @@
           <w:p>
             <w:pPr>
               <w:rPr>
-                <w:lang w:val="en-AT"/>
+                <w:lang/>
               </w:rPr>
             </w:pPr>
             <w:r>
               <w:rPr>
-                <w:lang w:val="en-AT"/>
+                <w:lang/>
               </w:rPr>
               <w:t>Attended People</w:t>
             </w:r>
@@ -132,11 +937,49 @@
             <w:tcW w:w="4508" w:type="dxa"/>
           </w:tcPr>
           <w:p>
-            <w:pPr>
-              <w:rPr>
-                <w:lang w:val="en-AT"/>
-              </w:rPr>
-            </w:pPr>
+            <w:r>
+              <w:rPr>
+                <w:lang/>
+              </w:rPr>
+              <w:t>Hörmansdorfer Moritz, Salnikow Nina</w:t>
+            </w:r>
+            <w:r>
+              <w:rPr>
+                <w:lang/>
+              </w:rPr>
+              <w:t>,</w:t>
+            </w:r>
+            <w:r>
+              <w:rPr>
+                <w:lang/>
+              </w:rPr>
+              <w:t xml:space="preserve"> Oberhumer Dominik</w:t>
+            </w:r>
+            <w:r>
+              <w:rPr>
+                <w:lang/>
+              </w:rPr>
+              <w:t>,</w:t>
+            </w:r>
+            <w:r>
+              <w:rPr>
+                <w:lang/>
+              </w:rPr>
+              <w:t xml:space="preserve"> Klasov</w:t>
+            </w:r>
+            <w:r>
+              <w:rPr>
+                <w:rFonts w:ascii="Aptos" w:hAnsi="Aptos" w:cs="Aptos"/>
+                <w:lang/>
+              </w:rPr>
+              <w:t>á</w:t>
+            </w:r>
+            <w:r>
+              <w:rPr>
+                <w:lang/>
+              </w:rPr>
+              <w:t xml:space="preserve"> Sara</w:t>
+            </w:r>
           </w:p>
         </w:tc>
       </w:tr>
@@ -144,76 +987,44 @@
     <w:p>
       <w:pPr>
         <w:rPr>
-          <w:lang w:val="en-AT"/>
-        </w:rPr>
-      </w:pPr>
-    </w:p>
-    <w:p>
-      <w:pPr>
-        <w:pStyle w:val="Heading1"/>
-        <w:rPr>
-          <w:lang w:val="en-AT"/>
-        </w:rPr>
-      </w:pPr>
-      <w:r>
-        <w:rPr>
-          <w:lang w:val="en-AT"/>
+          <w:lang/>
+        </w:rPr>
+      </w:pPr>
+    </w:p>
+    <w:p>
+      <w:pPr>
+        <w:pStyle w:val="berschrift1"/>
+      </w:pPr>
+      <w:r>
+        <w:rPr>
+          <w:lang/>
         </w:rPr>
         <w:t>Discussed Topics</w:t>
       </w:r>
     </w:p>
-    <w:p>
-      <w:pPr>
-        <w:rPr>
-          <w:lang w:val="en-AT"/>
-        </w:rPr>
-      </w:pPr>
-    </w:p>
-    <w:p>
-      <w:pPr>
-        <w:rPr>
-          <w:lang w:val="en-AT"/>
-        </w:rPr>
-      </w:pPr>
-    </w:p>
-    <w:p>
-      <w:pPr>
-        <w:pStyle w:val="Heading1"/>
-        <w:rPr>
-          <w:lang w:val="en-AT"/>
-        </w:rPr>
-      </w:pPr>
-      <w:r>
-        <w:rPr>
-          <w:lang w:val="en-AT"/>
+    <w:p/>
+    <w:p>
+      <w:pPr>
+        <w:pStyle w:val="berschrift1"/>
+      </w:pPr>
+      <w:r>
+        <w:rPr>
+          <w:lang/>
         </w:rPr>
         <w:t>Follow Up</w:t>
       </w:r>
     </w:p>
-    <w:p>
-      <w:pPr>
-        <w:rPr>
-          <w:lang w:val="en-AT"/>
-        </w:rPr>
-      </w:pPr>
-    </w:p>
-    <w:p>
-      <w:pPr>
-        <w:rPr>
-          <w:lang w:val="en-AT"/>
-        </w:rPr>
-      </w:pPr>
-    </w:p>
-    <w:p>
-      <w:pPr>
-        <w:pStyle w:val="Heading1"/>
-        <w:rPr>
-          <w:lang w:val="en-AT"/>
-        </w:rPr>
-      </w:pPr>
-      <w:r>
-        <w:rPr>
-          <w:lang w:val="en-AT"/>
+    <w:p/>
+    <w:p>
+      <w:pPr>
+        <w:pStyle w:val="berschrift1"/>
+        <w:rPr>
+          <w:lang/>
+        </w:rPr>
+      </w:pPr>
+      <w:r>
+        <w:rPr>
+          <w:lang/>
         </w:rPr>
         <w:t>Emergencies</w:t>
       </w:r>
@@ -221,14 +1032,7 @@
     <w:p>
       <w:pPr>
         <w:rPr>
-          <w:lang w:val="en-AT"/>
-        </w:rPr>
-      </w:pPr>
-    </w:p>
-    <w:p>
-      <w:pPr>
-        <w:rPr>
-          <w:lang w:val="en-AT"/>
+          <w:lang w:val="en-US"/>
         </w:rPr>
       </w:pPr>
     </w:p>
@@ -240,6 +1044,613 @@
     </w:sectPr>
   </w:body>
 </w:document>
+</file>
+
+<file path=word/endnotes.xml><?xml version="1.0" encoding="utf-8"?>
+<w:endnotes xmlns:wpc="http://schemas.microsoft.com/office/word/2010/wordprocessingCanvas" xmlns:cx="http://schemas.microsoft.com/office/drawing/2014/chartex" xmlns:cx1="http://schemas.microsoft.com/office/drawing/2015/9/8/chartex" xmlns:cx2="http://schemas.microsoft.com/office/drawing/2015/10/21/chartex" xmlns:cx3="http://schemas.microsoft.com/office/drawing/2016/5/9/chartex" xmlns:cx4="http://schemas.microsoft.com/office/drawing/2016/5/10/chartex" xmlns:cx5="http://schemas.microsoft.com/office/drawing/2016/5/11/chartex" xmlns:cx6="http://schemas.microsoft.com/office/drawing/2016/5/12/chartex" xmlns:cx7="http://schemas.microsoft.com/office/drawing/2016/5/13/chartex" xmlns:cx8="http://schemas.microsoft.com/office/drawing/2016/5/14/chartex" xmlns:mc="http://schemas.openxmlformats.org/markup-compatibility/2006" xmlns:aink="http://schemas.microsoft.com/office/drawing/2016/ink" xmlns:am3d="http://schemas.microsoft.com/office/drawing/2017/model3d" xmlns:o="urn:schemas-microsoft-com:office:office" xmlns:oel="http://schemas.microsoft.com/office/2019/extlst" xmlns:r="http://schemas.openxmlformats.org/officeDocument/2006/relationships" xmlns:m="http://schemas.openxmlformats.org/officeDocument/2006/math" xmlns:v="urn:schemas-microsoft-com:vml" xmlns:wp14="http://schemas.microsoft.com/office/word/2010/wordprocessingDrawing" xmlns:wp="http://schemas.openxmlformats.org/drawingml/2006/wordprocessingDrawing" xmlns:w10="urn:schemas-microsoft-com:office:word" xmlns:w="http://schemas.openxmlformats.org/wordprocessingml/2006/main" xmlns:w14="http://schemas.microsoft.com/office/word/2010/wordml" xmlns:w15="http://schemas.microsoft.com/office/word/2012/wordml" xmlns:w16cex="http://schemas.microsoft.com/office/word/2018/wordml/cex" xmlns:w16cid="http://schemas.microsoft.com/office/word/2016/wordml/cid" xmlns:w16="http://schemas.microsoft.com/office/word/2018/wordml" xmlns:w16du="http://schemas.microsoft.com/office/word/2023/wordml/word16du" xmlns:w16sdtdh="http://schemas.microsoft.com/office/word/2020/wordml/sdtdatahash" xmlns:w16sdtfl="http://schemas.microsoft.com/office/word/2024/wordml/sdtformatlock" xmlns:w16se="http://schemas.microsoft.com/office/word/2015/wordml/symex" xmlns:wpg="http://schemas.microsoft.com/office/word/2010/wordprocessingGroup" xmlns:wpi="http://schemas.microsoft.com/office/word/2010/wordprocessingInk" xmlns:wne="http://schemas.microsoft.com/office/word/2006/wordml" xmlns:wps="http://schemas.microsoft.com/office/word/2010/wordprocessingShape" mc:Ignorable="w14 w15 w16se w16cid w16 w16cex w16sdtdh w16sdtfl w16du wp14">
+  <w:endnote w:type="separator" w:id="-1">
+    <w:p>
+      <w:pPr>
+        <w:spacing w:after="0" w:line="240" w:lineRule="auto"/>
+      </w:pPr>
+      <w:r>
+        <w:separator/>
+      </w:r>
+    </w:p>
+  </w:endnote>
+  <w:endnote w:type="continuationSeparator" w:id="0">
+    <w:p>
+      <w:pPr>
+        <w:spacing w:after="0" w:line="240" w:lineRule="auto"/>
+      </w:pPr>
+      <w:r>
+        <w:continuationSeparator/>
+      </w:r>
+    </w:p>
+  </w:endnote>
+</w:endnotes>
+</file>
+
+<file path=word/footnotes.xml><?xml version="1.0" encoding="utf-8"?>
+<w:footnotes xmlns:wpc="http://schemas.microsoft.com/office/word/2010/wordprocessingCanvas" xmlns:cx="http://schemas.microsoft.com/office/drawing/2014/chartex" xmlns:cx1="http://schemas.microsoft.com/office/drawing/2015/9/8/chartex" xmlns:cx2="http://schemas.microsoft.com/office/drawing/2015/10/21/chartex" xmlns:cx3="http://schemas.microsoft.com/office/drawing/2016/5/9/chartex" xmlns:cx4="http://schemas.microsoft.com/office/drawing/2016/5/10/chartex" xmlns:cx5="http://schemas.microsoft.com/office/drawing/2016/5/11/chartex" xmlns:cx6="http://schemas.microsoft.com/office/drawing/2016/5/12/chartex" xmlns:cx7="http://schemas.microsoft.com/office/drawing/2016/5/13/chartex" xmlns:cx8="http://schemas.microsoft.com/office/drawing/2016/5/14/chartex" xmlns:mc="http://schemas.openxmlformats.org/markup-compatibility/2006" xmlns:aink="http://schemas.microsoft.com/office/drawing/2016/ink" xmlns:am3d="http://schemas.microsoft.com/office/drawing/2017/model3d" xmlns:o="urn:schemas-microsoft-com:office:office" xmlns:oel="http://schemas.microsoft.com/office/2019/extlst" xmlns:r="http://schemas.openxmlformats.org/officeDocument/2006/relationships" xmlns:m="http://schemas.openxmlformats.org/officeDocument/2006/math" xmlns:v="urn:schemas-microsoft-com:vml" xmlns:wp14="http://schemas.microsoft.com/office/word/2010/wordprocessingDrawing" xmlns:wp="http://schemas.openxmlformats.org/drawingml/2006/wordprocessingDrawing" xmlns:w10="urn:schemas-microsoft-com:office:word" xmlns:w="http://schemas.openxmlformats.org/wordprocessingml/2006/main" xmlns:w14="http://schemas.microsoft.com/office/word/2010/wordml" xmlns:w15="http://schemas.microsoft.com/office/word/2012/wordml" xmlns:w16cex="http://schemas.microsoft.com/office/word/2018/wordml/cex" xmlns:w16cid="http://schemas.microsoft.com/office/word/2016/wordml/cid" xmlns:w16="http://schemas.microsoft.com/office/word/2018/wordml" xmlns:w16du="http://schemas.microsoft.com/office/word/2023/wordml/word16du" xmlns:w16sdtdh="http://schemas.microsoft.com/office/word/2020/wordml/sdtdatahash" xmlns:w16sdtfl="http://schemas.microsoft.com/office/word/2024/wordml/sdtformatlock" xmlns:w16se="http://schemas.microsoft.com/office/word/2015/wordml/symex" xmlns:wpg="http://schemas.microsoft.com/office/word/2010/wordprocessingGroup" xmlns:wpi="http://schemas.microsoft.com/office/word/2010/wordprocessingInk" xmlns:wne="http://schemas.microsoft.com/office/word/2006/wordml" xmlns:wps="http://schemas.microsoft.com/office/word/2010/wordprocessingShape" mc:Ignorable="w14 w15 w16se w16cid w16 w16cex w16sdtdh w16sdtfl w16du wp14">
+  <w:footnote w:type="separator" w:id="-1">
+    <w:p>
+      <w:pPr>
+        <w:spacing w:after="0" w:line="240" w:lineRule="auto"/>
+      </w:pPr>
+      <w:r>
+        <w:separator/>
+      </w:r>
+    </w:p>
+  </w:footnote>
+  <w:footnote w:type="continuationSeparator" w:id="0">
+    <w:p>
+      <w:pPr>
+        <w:spacing w:after="0" w:line="240" w:lineRule="auto"/>
+      </w:pPr>
+      <w:r>
+        <w:continuationSeparator/>
+      </w:r>
+    </w:p>
+  </w:footnote>
+</w:footnotes>
+</file>
+
+<file path=word/numbering.xml><?xml version="1.0" encoding="utf-8"?>
+<w:numbering xmlns:wpc="http://schemas.microsoft.com/office/word/2010/wordprocessingCanvas" xmlns:cx="http://schemas.microsoft.com/office/drawing/2014/chartex" xmlns:cx1="http://schemas.microsoft.com/office/drawing/2015/9/8/chartex" xmlns:cx2="http://schemas.microsoft.com/office/drawing/2015/10/21/chartex" xmlns:cx3="http://schemas.microsoft.com/office/drawing/2016/5/9/chartex" xmlns:cx4="http://schemas.microsoft.com/office/drawing/2016/5/10/chartex" xmlns:cx5="http://schemas.microsoft.com/office/drawing/2016/5/11/chartex" xmlns:cx6="http://schemas.microsoft.com/office/drawing/2016/5/12/chartex" xmlns:cx7="http://schemas.microsoft.com/office/drawing/2016/5/13/chartex" xmlns:cx8="http://schemas.microsoft.com/office/drawing/2016/5/14/chartex" xmlns:mc="http://schemas.openxmlformats.org/markup-compatibility/2006" xmlns:aink="http://schemas.microsoft.com/office/drawing/2016/ink" xmlns:am3d="http://schemas.microsoft.com/office/drawing/2017/model3d" xmlns:o="urn:schemas-microsoft-com:office:office" xmlns:oel="http://schemas.microsoft.com/office/2019/extlst" xmlns:r="http://schemas.openxmlformats.org/officeDocument/2006/relationships" xmlns:m="http://schemas.openxmlformats.org/officeDocument/2006/math" xmlns:v="urn:schemas-microsoft-com:vml" xmlns:wp14="http://schemas.microsoft.com/office/word/2010/wordprocessingDrawing" xmlns:wp="http://schemas.openxmlformats.org/drawingml/2006/wordprocessingDrawing" xmlns:w10="urn:schemas-microsoft-com:office:word" xmlns:w="http://schemas.openxmlformats.org/wordprocessingml/2006/main" xmlns:w14="http://schemas.microsoft.com/office/word/2010/wordml" xmlns:w15="http://schemas.microsoft.com/office/word/2012/wordml" xmlns:w16cex="http://schemas.microsoft.com/office/word/2018/wordml/cex" xmlns:w16cid="http://schemas.microsoft.com/office/word/2016/wordml/cid" xmlns:w16="http://schemas.microsoft.com/office/word/2018/wordml" xmlns:w16du="http://schemas.microsoft.com/office/word/2023/wordml/word16du" xmlns:w16sdtdh="http://schemas.microsoft.com/office/word/2020/wordml/sdtdatahash" xmlns:w16sdtfl="http://schemas.microsoft.com/office/word/2024/wordml/sdtformatlock" xmlns:w16se="http://schemas.microsoft.com/office/word/2015/wordml/symex" xmlns:wpg="http://schemas.microsoft.com/office/word/2010/wordprocessingGroup" xmlns:wpi="http://schemas.microsoft.com/office/word/2010/wordprocessingInk" xmlns:wne="http://schemas.microsoft.com/office/word/2006/wordml" xmlns:wps="http://schemas.microsoft.com/office/word/2010/wordprocessingShape" mc:Ignorable="w14 w15 w16se w16cid w16 w16cex w16sdtdh w16sdtfl w16du wp14">
+  <w:abstractNum w:abstractNumId="0" w15:restartNumberingAfterBreak="0">
+    <w:nsid w:val="094C664A"/>
+    <w:multiLevelType w:val="hybridMultilevel"/>
+    <w:tmpl w:val="741CBB48"/>
+    <w:lvl w:ilvl="0" w:tplc="0407000F">
+      <w:start w:val="1"/>
+      <w:numFmt w:val="decimal"/>
+      <w:lvlText w:val="%1."/>
+      <w:lvlJc w:val="left"/>
+      <w:pPr>
+        <w:ind w:left="720" w:hanging="360"/>
+      </w:pPr>
+      <w:rPr>
+        <w:rFonts w:hint="default"/>
+      </w:rPr>
+    </w:lvl>
+    <w:lvl w:ilvl="1" w:tplc="04070019" w:tentative="1">
+      <w:start w:val="1"/>
+      <w:numFmt w:val="lowerLetter"/>
+      <w:lvlText w:val="%2."/>
+      <w:lvlJc w:val="left"/>
+      <w:pPr>
+        <w:ind w:left="1440" w:hanging="360"/>
+      </w:pPr>
+    </w:lvl>
+    <w:lvl w:ilvl="2" w:tplc="0407001B" w:tentative="1">
+      <w:start w:val="1"/>
+      <w:numFmt w:val="lowerRoman"/>
+      <w:lvlText w:val="%3."/>
+      <w:lvlJc w:val="right"/>
+      <w:pPr>
+        <w:ind w:left="2160" w:hanging="180"/>
+      </w:pPr>
+    </w:lvl>
+    <w:lvl w:ilvl="3" w:tplc="0407000F" w:tentative="1">
+      <w:start w:val="1"/>
+      <w:numFmt w:val="decimal"/>
+      <w:lvlText w:val="%4."/>
+      <w:lvlJc w:val="left"/>
+      <w:pPr>
+        <w:ind w:left="2880" w:hanging="360"/>
+      </w:pPr>
+    </w:lvl>
+    <w:lvl w:ilvl="4" w:tplc="04070019" w:tentative="1">
+      <w:start w:val="1"/>
+      <w:numFmt w:val="lowerLetter"/>
+      <w:lvlText w:val="%5."/>
+      <w:lvlJc w:val="left"/>
+      <w:pPr>
+        <w:ind w:left="3600" w:hanging="360"/>
+      </w:pPr>
+    </w:lvl>
+    <w:lvl w:ilvl="5" w:tplc="0407001B" w:tentative="1">
+      <w:start w:val="1"/>
+      <w:numFmt w:val="lowerRoman"/>
+      <w:lvlText w:val="%6."/>
+      <w:lvlJc w:val="right"/>
+      <w:pPr>
+        <w:ind w:left="4320" w:hanging="180"/>
+      </w:pPr>
+    </w:lvl>
+    <w:lvl w:ilvl="6" w:tplc="0407000F" w:tentative="1">
+      <w:start w:val="1"/>
+      <w:numFmt w:val="decimal"/>
+      <w:lvlText w:val="%7."/>
+      <w:lvlJc w:val="left"/>
+      <w:pPr>
+        <w:ind w:left="5040" w:hanging="360"/>
+      </w:pPr>
+    </w:lvl>
+    <w:lvl w:ilvl="7" w:tplc="04070019" w:tentative="1">
+      <w:start w:val="1"/>
+      <w:numFmt w:val="lowerLetter"/>
+      <w:lvlText w:val="%8."/>
+      <w:lvlJc w:val="left"/>
+      <w:pPr>
+        <w:ind w:left="5760" w:hanging="360"/>
+      </w:pPr>
+    </w:lvl>
+    <w:lvl w:ilvl="8" w:tplc="0407001B" w:tentative="1">
+      <w:start w:val="1"/>
+      <w:numFmt w:val="lowerRoman"/>
+      <w:lvlText w:val="%9."/>
+      <w:lvlJc w:val="right"/>
+      <w:pPr>
+        <w:ind w:left="6480" w:hanging="180"/>
+      </w:pPr>
+    </w:lvl>
+  </w:abstractNum>
+  <w:abstractNum w:abstractNumId="1" w15:restartNumberingAfterBreak="0">
+    <w:nsid w:val="37723E7E"/>
+    <w:multiLevelType w:val="hybridMultilevel"/>
+    <w:tmpl w:val="201AF30E"/>
+    <w:lvl w:ilvl="0" w:tplc="0407000F">
+      <w:start w:val="1"/>
+      <w:numFmt w:val="decimal"/>
+      <w:lvlText w:val="%1."/>
+      <w:lvlJc w:val="left"/>
+      <w:pPr>
+        <w:ind w:left="720" w:hanging="360"/>
+      </w:pPr>
+      <w:rPr>
+        <w:rFonts w:hint="default"/>
+      </w:rPr>
+    </w:lvl>
+    <w:lvl w:ilvl="1" w:tplc="04070019" w:tentative="1">
+      <w:start w:val="1"/>
+      <w:numFmt w:val="lowerLetter"/>
+      <w:lvlText w:val="%2."/>
+      <w:lvlJc w:val="left"/>
+      <w:pPr>
+        <w:ind w:left="1440" w:hanging="360"/>
+      </w:pPr>
+    </w:lvl>
+    <w:lvl w:ilvl="2" w:tplc="0407001B" w:tentative="1">
+      <w:start w:val="1"/>
+      <w:numFmt w:val="lowerRoman"/>
+      <w:lvlText w:val="%3."/>
+      <w:lvlJc w:val="right"/>
+      <w:pPr>
+        <w:ind w:left="2160" w:hanging="180"/>
+      </w:pPr>
+    </w:lvl>
+    <w:lvl w:ilvl="3" w:tplc="0407000F" w:tentative="1">
+      <w:start w:val="1"/>
+      <w:numFmt w:val="decimal"/>
+      <w:lvlText w:val="%4."/>
+      <w:lvlJc w:val="left"/>
+      <w:pPr>
+        <w:ind w:left="2880" w:hanging="360"/>
+      </w:pPr>
+    </w:lvl>
+    <w:lvl w:ilvl="4" w:tplc="04070019" w:tentative="1">
+      <w:start w:val="1"/>
+      <w:numFmt w:val="lowerLetter"/>
+      <w:lvlText w:val="%5."/>
+      <w:lvlJc w:val="left"/>
+      <w:pPr>
+        <w:ind w:left="3600" w:hanging="360"/>
+      </w:pPr>
+    </w:lvl>
+    <w:lvl w:ilvl="5" w:tplc="0407001B" w:tentative="1">
+      <w:start w:val="1"/>
+      <w:numFmt w:val="lowerRoman"/>
+      <w:lvlText w:val="%6."/>
+      <w:lvlJc w:val="right"/>
+      <w:pPr>
+        <w:ind w:left="4320" w:hanging="180"/>
+      </w:pPr>
+    </w:lvl>
+    <w:lvl w:ilvl="6" w:tplc="0407000F" w:tentative="1">
+      <w:start w:val="1"/>
+      <w:numFmt w:val="decimal"/>
+      <w:lvlText w:val="%7."/>
+      <w:lvlJc w:val="left"/>
+      <w:pPr>
+        <w:ind w:left="5040" w:hanging="360"/>
+      </w:pPr>
+    </w:lvl>
+    <w:lvl w:ilvl="7" w:tplc="04070019" w:tentative="1">
+      <w:start w:val="1"/>
+      <w:numFmt w:val="lowerLetter"/>
+      <w:lvlText w:val="%8."/>
+      <w:lvlJc w:val="left"/>
+      <w:pPr>
+        <w:ind w:left="5760" w:hanging="360"/>
+      </w:pPr>
+    </w:lvl>
+    <w:lvl w:ilvl="8" w:tplc="0407001B" w:tentative="1">
+      <w:start w:val="1"/>
+      <w:numFmt w:val="lowerRoman"/>
+      <w:lvlText w:val="%9."/>
+      <w:lvlJc w:val="right"/>
+      <w:pPr>
+        <w:ind w:left="6480" w:hanging="180"/>
+      </w:pPr>
+    </w:lvl>
+  </w:abstractNum>
+  <w:abstractNum w:abstractNumId="2" w15:restartNumberingAfterBreak="0">
+    <w:nsid w:val="513A52AA"/>
+    <w:multiLevelType w:val="hybridMultilevel"/>
+    <w:tmpl w:val="A8FC6794"/>
+    <w:lvl w:ilvl="0" w:tplc="0407000D">
+      <w:start w:val="1"/>
+      <w:numFmt w:val="bullet"/>
+      <w:lvlText w:val=""/>
+      <w:lvlJc w:val="left"/>
+      <w:pPr>
+        <w:ind w:left="720" w:hanging="360"/>
+      </w:pPr>
+      <w:rPr>
+        <w:rFonts w:ascii="Wingdings" w:hAnsi="Wingdings" w:hint="default"/>
+      </w:rPr>
+    </w:lvl>
+    <w:lvl w:ilvl="1" w:tplc="FFFFFFFF" w:tentative="1">
+      <w:start w:val="1"/>
+      <w:numFmt w:val="lowerLetter"/>
+      <w:lvlText w:val="%2."/>
+      <w:lvlJc w:val="left"/>
+      <w:pPr>
+        <w:ind w:left="1440" w:hanging="360"/>
+      </w:pPr>
+    </w:lvl>
+    <w:lvl w:ilvl="2" w:tplc="FFFFFFFF" w:tentative="1">
+      <w:start w:val="1"/>
+      <w:numFmt w:val="lowerRoman"/>
+      <w:lvlText w:val="%3."/>
+      <w:lvlJc w:val="right"/>
+      <w:pPr>
+        <w:ind w:left="2160" w:hanging="180"/>
+      </w:pPr>
+    </w:lvl>
+    <w:lvl w:ilvl="3" w:tplc="FFFFFFFF" w:tentative="1">
+      <w:start w:val="1"/>
+      <w:numFmt w:val="decimal"/>
+      <w:lvlText w:val="%4."/>
+      <w:lvlJc w:val="left"/>
+      <w:pPr>
+        <w:ind w:left="2880" w:hanging="360"/>
+      </w:pPr>
+    </w:lvl>
+    <w:lvl w:ilvl="4" w:tplc="FFFFFFFF" w:tentative="1">
+      <w:start w:val="1"/>
+      <w:numFmt w:val="lowerLetter"/>
+      <w:lvlText w:val="%5."/>
+      <w:lvlJc w:val="left"/>
+      <w:pPr>
+        <w:ind w:left="3600" w:hanging="360"/>
+      </w:pPr>
+    </w:lvl>
+    <w:lvl w:ilvl="5" w:tplc="FFFFFFFF" w:tentative="1">
+      <w:start w:val="1"/>
+      <w:numFmt w:val="lowerRoman"/>
+      <w:lvlText w:val="%6."/>
+      <w:lvlJc w:val="right"/>
+      <w:pPr>
+        <w:ind w:left="4320" w:hanging="180"/>
+      </w:pPr>
+    </w:lvl>
+    <w:lvl w:ilvl="6" w:tplc="FFFFFFFF" w:tentative="1">
+      <w:start w:val="1"/>
+      <w:numFmt w:val="decimal"/>
+      <w:lvlText w:val="%7."/>
+      <w:lvlJc w:val="left"/>
+      <w:pPr>
+        <w:ind w:left="5040" w:hanging="360"/>
+      </w:pPr>
+    </w:lvl>
+    <w:lvl w:ilvl="7" w:tplc="FFFFFFFF" w:tentative="1">
+      <w:start w:val="1"/>
+      <w:numFmt w:val="lowerLetter"/>
+      <w:lvlText w:val="%8."/>
+      <w:lvlJc w:val="left"/>
+      <w:pPr>
+        <w:ind w:left="5760" w:hanging="360"/>
+      </w:pPr>
+    </w:lvl>
+    <w:lvl w:ilvl="8" w:tplc="FFFFFFFF" w:tentative="1">
+      <w:start w:val="1"/>
+      <w:numFmt w:val="lowerRoman"/>
+      <w:lvlText w:val="%9."/>
+      <w:lvlJc w:val="right"/>
+      <w:pPr>
+        <w:ind w:left="6480" w:hanging="180"/>
+      </w:pPr>
+    </w:lvl>
+  </w:abstractNum>
+  <w:abstractNum w:abstractNumId="3" w15:restartNumberingAfterBreak="0">
+    <w:nsid w:val="6302061E"/>
+    <w:multiLevelType w:val="hybridMultilevel"/>
+    <w:tmpl w:val="6FE0723A"/>
+    <w:lvl w:ilvl="0" w:tplc="0407000D">
+      <w:start w:val="1"/>
+      <w:numFmt w:val="bullet"/>
+      <w:lvlText w:val=""/>
+      <w:lvlJc w:val="left"/>
+      <w:pPr>
+        <w:ind w:left="720" w:hanging="360"/>
+      </w:pPr>
+      <w:rPr>
+        <w:rFonts w:ascii="Wingdings" w:hAnsi="Wingdings" w:hint="default"/>
+      </w:rPr>
+    </w:lvl>
+    <w:lvl w:ilvl="1" w:tplc="FFFFFFFF" w:tentative="1">
+      <w:start w:val="1"/>
+      <w:numFmt w:val="lowerLetter"/>
+      <w:lvlText w:val="%2."/>
+      <w:lvlJc w:val="left"/>
+      <w:pPr>
+        <w:ind w:left="1440" w:hanging="360"/>
+      </w:pPr>
+    </w:lvl>
+    <w:lvl w:ilvl="2" w:tplc="FFFFFFFF" w:tentative="1">
+      <w:start w:val="1"/>
+      <w:numFmt w:val="lowerRoman"/>
+      <w:lvlText w:val="%3."/>
+      <w:lvlJc w:val="right"/>
+      <w:pPr>
+        <w:ind w:left="2160" w:hanging="180"/>
+      </w:pPr>
+    </w:lvl>
+    <w:lvl w:ilvl="3" w:tplc="FFFFFFFF" w:tentative="1">
+      <w:start w:val="1"/>
+      <w:numFmt w:val="decimal"/>
+      <w:lvlText w:val="%4."/>
+      <w:lvlJc w:val="left"/>
+      <w:pPr>
+        <w:ind w:left="2880" w:hanging="360"/>
+      </w:pPr>
+    </w:lvl>
+    <w:lvl w:ilvl="4" w:tplc="FFFFFFFF" w:tentative="1">
+      <w:start w:val="1"/>
+      <w:numFmt w:val="lowerLetter"/>
+      <w:lvlText w:val="%5."/>
+      <w:lvlJc w:val="left"/>
+      <w:pPr>
+        <w:ind w:left="3600" w:hanging="360"/>
+      </w:pPr>
+    </w:lvl>
+    <w:lvl w:ilvl="5" w:tplc="FFFFFFFF" w:tentative="1">
+      <w:start w:val="1"/>
+      <w:numFmt w:val="lowerRoman"/>
+      <w:lvlText w:val="%6."/>
+      <w:lvlJc w:val="right"/>
+      <w:pPr>
+        <w:ind w:left="4320" w:hanging="180"/>
+      </w:pPr>
+    </w:lvl>
+    <w:lvl w:ilvl="6" w:tplc="FFFFFFFF" w:tentative="1">
+      <w:start w:val="1"/>
+      <w:numFmt w:val="decimal"/>
+      <w:lvlText w:val="%7."/>
+      <w:lvlJc w:val="left"/>
+      <w:pPr>
+        <w:ind w:left="5040" w:hanging="360"/>
+      </w:pPr>
+    </w:lvl>
+    <w:lvl w:ilvl="7" w:tplc="FFFFFFFF" w:tentative="1">
+      <w:start w:val="1"/>
+      <w:numFmt w:val="lowerLetter"/>
+      <w:lvlText w:val="%8."/>
+      <w:lvlJc w:val="left"/>
+      <w:pPr>
+        <w:ind w:left="5760" w:hanging="360"/>
+      </w:pPr>
+    </w:lvl>
+    <w:lvl w:ilvl="8" w:tplc="FFFFFFFF" w:tentative="1">
+      <w:start w:val="1"/>
+      <w:numFmt w:val="lowerRoman"/>
+      <w:lvlText w:val="%9."/>
+      <w:lvlJc w:val="right"/>
+      <w:pPr>
+        <w:ind w:left="6480" w:hanging="180"/>
+      </w:pPr>
+    </w:lvl>
+  </w:abstractNum>
+  <w:abstractNum w:abstractNumId="4" w15:restartNumberingAfterBreak="0">
+    <w:nsid w:val="67671802"/>
+    <w:multiLevelType w:val="hybridMultilevel"/>
+    <w:tmpl w:val="0832BF14"/>
+    <w:lvl w:ilvl="0" w:tplc="0407000F">
+      <w:start w:val="1"/>
+      <w:numFmt w:val="decimal"/>
+      <w:lvlText w:val="%1."/>
+      <w:lvlJc w:val="left"/>
+      <w:pPr>
+        <w:ind w:left="720" w:hanging="360"/>
+      </w:pPr>
+      <w:rPr>
+        <w:rFonts w:hint="default"/>
+      </w:rPr>
+    </w:lvl>
+    <w:lvl w:ilvl="1" w:tplc="04070019" w:tentative="1">
+      <w:start w:val="1"/>
+      <w:numFmt w:val="lowerLetter"/>
+      <w:lvlText w:val="%2."/>
+      <w:lvlJc w:val="left"/>
+      <w:pPr>
+        <w:ind w:left="1440" w:hanging="360"/>
+      </w:pPr>
+    </w:lvl>
+    <w:lvl w:ilvl="2" w:tplc="0407001B" w:tentative="1">
+      <w:start w:val="1"/>
+      <w:numFmt w:val="lowerRoman"/>
+      <w:lvlText w:val="%3."/>
+      <w:lvlJc w:val="right"/>
+      <w:pPr>
+        <w:ind w:left="2160" w:hanging="180"/>
+      </w:pPr>
+    </w:lvl>
+    <w:lvl w:ilvl="3" w:tplc="0407000F" w:tentative="1">
+      <w:start w:val="1"/>
+      <w:numFmt w:val="decimal"/>
+      <w:lvlText w:val="%4."/>
+      <w:lvlJc w:val="left"/>
+      <w:pPr>
+        <w:ind w:left="2880" w:hanging="360"/>
+      </w:pPr>
+    </w:lvl>
+    <w:lvl w:ilvl="4" w:tplc="04070019" w:tentative="1">
+      <w:start w:val="1"/>
+      <w:numFmt w:val="lowerLetter"/>
+      <w:lvlText w:val="%5."/>
+      <w:lvlJc w:val="left"/>
+      <w:pPr>
+        <w:ind w:left="3600" w:hanging="360"/>
+      </w:pPr>
+    </w:lvl>
+    <w:lvl w:ilvl="5" w:tplc="0407001B" w:tentative="1">
+      <w:start w:val="1"/>
+      <w:numFmt w:val="lowerRoman"/>
+      <w:lvlText w:val="%6."/>
+      <w:lvlJc w:val="right"/>
+      <w:pPr>
+        <w:ind w:left="4320" w:hanging="180"/>
+      </w:pPr>
+    </w:lvl>
+    <w:lvl w:ilvl="6" w:tplc="0407000F" w:tentative="1">
+      <w:start w:val="1"/>
+      <w:numFmt w:val="decimal"/>
+      <w:lvlText w:val="%7."/>
+      <w:lvlJc w:val="left"/>
+      <w:pPr>
+        <w:ind w:left="5040" w:hanging="360"/>
+      </w:pPr>
+    </w:lvl>
+    <w:lvl w:ilvl="7" w:tplc="04070019" w:tentative="1">
+      <w:start w:val="1"/>
+      <w:numFmt w:val="lowerLetter"/>
+      <w:lvlText w:val="%8."/>
+      <w:lvlJc w:val="left"/>
+      <w:pPr>
+        <w:ind w:left="5760" w:hanging="360"/>
+      </w:pPr>
+    </w:lvl>
+    <w:lvl w:ilvl="8" w:tplc="0407001B" w:tentative="1">
+      <w:start w:val="1"/>
+      <w:numFmt w:val="lowerRoman"/>
+      <w:lvlText w:val="%9."/>
+      <w:lvlJc w:val="right"/>
+      <w:pPr>
+        <w:ind w:left="6480" w:hanging="180"/>
+      </w:pPr>
+    </w:lvl>
+  </w:abstractNum>
+  <w:abstractNum w:abstractNumId="5" w15:restartNumberingAfterBreak="0">
+    <w:nsid w:val="707919E2"/>
+    <w:multiLevelType w:val="hybridMultilevel"/>
+    <w:tmpl w:val="4CDACA04"/>
+    <w:lvl w:ilvl="0" w:tplc="0407000F">
+      <w:start w:val="1"/>
+      <w:numFmt w:val="decimal"/>
+      <w:lvlText w:val="%1."/>
+      <w:lvlJc w:val="left"/>
+      <w:pPr>
+        <w:ind w:left="720" w:hanging="360"/>
+      </w:pPr>
+      <w:rPr>
+        <w:rFonts w:hint="default"/>
+      </w:rPr>
+    </w:lvl>
+    <w:lvl w:ilvl="1" w:tplc="04070019" w:tentative="1">
+      <w:start w:val="1"/>
+      <w:numFmt w:val="lowerLetter"/>
+      <w:lvlText w:val="%2."/>
+      <w:lvlJc w:val="left"/>
+      <w:pPr>
+        <w:ind w:left="1440" w:hanging="360"/>
+      </w:pPr>
+    </w:lvl>
+    <w:lvl w:ilvl="2" w:tplc="0407001B" w:tentative="1">
+      <w:start w:val="1"/>
+      <w:numFmt w:val="lowerRoman"/>
+      <w:lvlText w:val="%3."/>
+      <w:lvlJc w:val="right"/>
+      <w:pPr>
+        <w:ind w:left="2160" w:hanging="180"/>
+      </w:pPr>
+    </w:lvl>
+    <w:lvl w:ilvl="3" w:tplc="0407000F" w:tentative="1">
+      <w:start w:val="1"/>
+      <w:numFmt w:val="decimal"/>
+      <w:lvlText w:val="%4."/>
+      <w:lvlJc w:val="left"/>
+      <w:pPr>
+        <w:ind w:left="2880" w:hanging="360"/>
+      </w:pPr>
+    </w:lvl>
+    <w:lvl w:ilvl="4" w:tplc="04070019" w:tentative="1">
+      <w:start w:val="1"/>
+      <w:numFmt w:val="lowerLetter"/>
+      <w:lvlText w:val="%5."/>
+      <w:lvlJc w:val="left"/>
+      <w:pPr>
+        <w:ind w:left="3600" w:hanging="360"/>
+      </w:pPr>
+    </w:lvl>
+    <w:lvl w:ilvl="5" w:tplc="0407001B" w:tentative="1">
+      <w:start w:val="1"/>
+      <w:numFmt w:val="lowerRoman"/>
+      <w:lvlText w:val="%6."/>
+      <w:lvlJc w:val="right"/>
+      <w:pPr>
+        <w:ind w:left="4320" w:hanging="180"/>
+      </w:pPr>
+    </w:lvl>
+    <w:lvl w:ilvl="6" w:tplc="0407000F" w:tentative="1">
+      <w:start w:val="1"/>
+      <w:numFmt w:val="decimal"/>
+      <w:lvlText w:val="%7."/>
+      <w:lvlJc w:val="left"/>
+      <w:pPr>
+        <w:ind w:left="5040" w:hanging="360"/>
+      </w:pPr>
+    </w:lvl>
+    <w:lvl w:ilvl="7" w:tplc="04070019" w:tentative="1">
+      <w:start w:val="1"/>
+      <w:numFmt w:val="lowerLetter"/>
+      <w:lvlText w:val="%8."/>
+      <w:lvlJc w:val="left"/>
+      <w:pPr>
+        <w:ind w:left="5760" w:hanging="360"/>
+      </w:pPr>
+    </w:lvl>
+    <w:lvl w:ilvl="8" w:tplc="0407001B" w:tentative="1">
+      <w:start w:val="1"/>
+      <w:numFmt w:val="lowerRoman"/>
+      <w:lvlText w:val="%9."/>
+      <w:lvlJc w:val="right"/>
+      <w:pPr>
+        <w:ind w:left="6480" w:hanging="180"/>
+      </w:pPr>
+    </w:lvl>
+  </w:abstractNum>
+  <w:num w:numId="1" w16cid:durableId="1758332397">
+    <w:abstractNumId w:val="4"/>
+  </w:num>
+  <w:num w:numId="2" w16cid:durableId="1522275966">
+    <w:abstractNumId w:val="5"/>
+  </w:num>
+  <w:num w:numId="3" w16cid:durableId="595862890">
+    <w:abstractNumId w:val="1"/>
+  </w:num>
+  <w:num w:numId="4" w16cid:durableId="1038428910">
+    <w:abstractNumId w:val="0"/>
+  </w:num>
+  <w:num w:numId="5" w16cid:durableId="1578440286">
+    <w:abstractNumId w:val="3"/>
+  </w:num>
+  <w:num w:numId="6" w16cid:durableId="161432392">
+    <w:abstractNumId w:val="2"/>
+  </w:num>
+</w:numbering>
 </file>
 
 <file path=word/styles.xml><?xml version="1.0" encoding="utf-8"?>
@@ -639,15 +2050,15 @@
     <w:lsdException w:name="Unresolved Mention" w:semiHidden="1" w:unhideWhenUsed="1"/>
     <w:lsdException w:name="Smart Link" w:semiHidden="1" w:unhideWhenUsed="1"/>
   </w:latentStyles>
-  <w:style w:type="paragraph" w:default="1" w:styleId="Normal">
+  <w:style w:type="paragraph" w:default="1" w:styleId="Standard">
     <w:name w:val="Normal"/>
     <w:qFormat/>
   </w:style>
-  <w:style w:type="paragraph" w:styleId="Heading1">
+  <w:style w:type="paragraph" w:styleId="berschrift1">
     <w:name w:val="heading 1"/>
-    <w:basedOn w:val="Normal"/>
-    <w:next w:val="Normal"/>
-    <w:link w:val="Heading1Char"/>
+    <w:basedOn w:val="Standard"/>
+    <w:next w:val="Standard"/>
+    <w:link w:val="berschrift1Zchn"/>
     <w:uiPriority w:val="9"/>
     <w:qFormat/>
     <w:rsid w:val="00E62764"/>
@@ -664,11 +2075,11 @@
       <w:szCs w:val="40"/>
     </w:rPr>
   </w:style>
-  <w:style w:type="paragraph" w:styleId="Heading2">
+  <w:style w:type="paragraph" w:styleId="berschrift2">
     <w:name w:val="heading 2"/>
-    <w:basedOn w:val="Normal"/>
-    <w:next w:val="Normal"/>
-    <w:link w:val="Heading2Char"/>
+    <w:basedOn w:val="Standard"/>
+    <w:next w:val="Standard"/>
+    <w:link w:val="berschrift2Zchn"/>
     <w:uiPriority w:val="9"/>
     <w:semiHidden/>
     <w:unhideWhenUsed/>
@@ -687,11 +2098,11 @@
       <w:szCs w:val="32"/>
     </w:rPr>
   </w:style>
-  <w:style w:type="paragraph" w:styleId="Heading3">
+  <w:style w:type="paragraph" w:styleId="berschrift3">
     <w:name w:val="heading 3"/>
-    <w:basedOn w:val="Normal"/>
-    <w:next w:val="Normal"/>
-    <w:link w:val="Heading3Char"/>
+    <w:basedOn w:val="Standard"/>
+    <w:next w:val="Standard"/>
+    <w:link w:val="berschrift3Zchn"/>
     <w:uiPriority w:val="9"/>
     <w:semiHidden/>
     <w:unhideWhenUsed/>
@@ -710,11 +2121,11 @@
       <w:szCs w:val="28"/>
     </w:rPr>
   </w:style>
-  <w:style w:type="paragraph" w:styleId="Heading4">
+  <w:style w:type="paragraph" w:styleId="berschrift4">
     <w:name w:val="heading 4"/>
-    <w:basedOn w:val="Normal"/>
-    <w:next w:val="Normal"/>
-    <w:link w:val="Heading4Char"/>
+    <w:basedOn w:val="Standard"/>
+    <w:next w:val="Standard"/>
+    <w:link w:val="berschrift4Zchn"/>
     <w:uiPriority w:val="9"/>
     <w:semiHidden/>
     <w:unhideWhenUsed/>
@@ -733,11 +2144,11 @@
       <w:color w:val="0F4761" w:themeColor="accent1" w:themeShade="BF"/>
     </w:rPr>
   </w:style>
-  <w:style w:type="paragraph" w:styleId="Heading5">
+  <w:style w:type="paragraph" w:styleId="berschrift5">
     <w:name w:val="heading 5"/>
-    <w:basedOn w:val="Normal"/>
-    <w:next w:val="Normal"/>
-    <w:link w:val="Heading5Char"/>
+    <w:basedOn w:val="Standard"/>
+    <w:next w:val="Standard"/>
+    <w:link w:val="berschrift5Zchn"/>
     <w:uiPriority w:val="9"/>
     <w:semiHidden/>
     <w:unhideWhenUsed/>
@@ -754,11 +2165,11 @@
       <w:color w:val="0F4761" w:themeColor="accent1" w:themeShade="BF"/>
     </w:rPr>
   </w:style>
-  <w:style w:type="paragraph" w:styleId="Heading6">
+  <w:style w:type="paragraph" w:styleId="berschrift6">
     <w:name w:val="heading 6"/>
-    <w:basedOn w:val="Normal"/>
-    <w:next w:val="Normal"/>
-    <w:link w:val="Heading6Char"/>
+    <w:basedOn w:val="Standard"/>
+    <w:next w:val="Standard"/>
+    <w:link w:val="berschrift6Zchn"/>
     <w:uiPriority w:val="9"/>
     <w:semiHidden/>
     <w:unhideWhenUsed/>
@@ -777,11 +2188,11 @@
       <w:color w:val="595959" w:themeColor="text1" w:themeTint="A6"/>
     </w:rPr>
   </w:style>
-  <w:style w:type="paragraph" w:styleId="Heading7">
+  <w:style w:type="paragraph" w:styleId="berschrift7">
     <w:name w:val="heading 7"/>
-    <w:basedOn w:val="Normal"/>
-    <w:next w:val="Normal"/>
-    <w:link w:val="Heading7Char"/>
+    <w:basedOn w:val="Standard"/>
+    <w:next w:val="Standard"/>
+    <w:link w:val="berschrift7Zchn"/>
     <w:uiPriority w:val="9"/>
     <w:semiHidden/>
     <w:unhideWhenUsed/>
@@ -798,11 +2209,11 @@
       <w:color w:val="595959" w:themeColor="text1" w:themeTint="A6"/>
     </w:rPr>
   </w:style>
-  <w:style w:type="paragraph" w:styleId="Heading8">
+  <w:style w:type="paragraph" w:styleId="berschrift8">
     <w:name w:val="heading 8"/>
-    <w:basedOn w:val="Normal"/>
-    <w:next w:val="Normal"/>
-    <w:link w:val="Heading8Char"/>
+    <w:basedOn w:val="Standard"/>
+    <w:next w:val="Standard"/>
+    <w:link w:val="berschrift8Zchn"/>
     <w:uiPriority w:val="9"/>
     <w:semiHidden/>
     <w:unhideWhenUsed/>
@@ -821,11 +2232,11 @@
       <w:color w:val="272727" w:themeColor="text1" w:themeTint="D8"/>
     </w:rPr>
   </w:style>
-  <w:style w:type="paragraph" w:styleId="Heading9">
+  <w:style w:type="paragraph" w:styleId="berschrift9">
     <w:name w:val="heading 9"/>
-    <w:basedOn w:val="Normal"/>
-    <w:next w:val="Normal"/>
-    <w:link w:val="Heading9Char"/>
+    <w:basedOn w:val="Standard"/>
+    <w:next w:val="Standard"/>
+    <w:link w:val="berschrift9Zchn"/>
     <w:uiPriority w:val="9"/>
     <w:semiHidden/>
     <w:unhideWhenUsed/>
@@ -842,13 +2253,12 @@
       <w:color w:val="272727" w:themeColor="text1" w:themeTint="D8"/>
     </w:rPr>
   </w:style>
-  <w:style w:type="character" w:default="1" w:styleId="DefaultParagraphFont">
+  <w:style w:type="character" w:default="1" w:styleId="Absatz-Standardschriftart">
     <w:name w:val="Default Paragraph Font"/>
     <w:uiPriority w:val="1"/>
-    <w:semiHidden/>
     <w:unhideWhenUsed/>
   </w:style>
-  <w:style w:type="table" w:default="1" w:styleId="TableNormal">
+  <w:style w:type="table" w:default="1" w:styleId="NormaleTabelle">
     <w:name w:val="Normal Table"/>
     <w:uiPriority w:val="99"/>
     <w:semiHidden/>
@@ -863,16 +2273,16 @@
       </w:tblCellMar>
     </w:tblPr>
   </w:style>
-  <w:style w:type="numbering" w:default="1" w:styleId="NoList">
+  <w:style w:type="numbering" w:default="1" w:styleId="KeineListe">
     <w:name w:val="No List"/>
     <w:uiPriority w:val="99"/>
     <w:semiHidden/>
     <w:unhideWhenUsed/>
   </w:style>
-  <w:style w:type="character" w:customStyle="1" w:styleId="Heading1Char">
-    <w:name w:val="Heading 1 Char"/>
-    <w:basedOn w:val="DefaultParagraphFont"/>
-    <w:link w:val="Heading1"/>
+  <w:style w:type="character" w:customStyle="1" w:styleId="berschrift1Zchn">
+    <w:name w:val="Überschrift 1 Zchn"/>
+    <w:basedOn w:val="Absatz-Standardschriftart"/>
+    <w:link w:val="berschrift1"/>
     <w:uiPriority w:val="9"/>
     <w:rsid w:val="00E62764"/>
     <w:rPr>
@@ -882,10 +2292,10 @@
       <w:szCs w:val="40"/>
     </w:rPr>
   </w:style>
-  <w:style w:type="character" w:customStyle="1" w:styleId="Heading2Char">
-    <w:name w:val="Heading 2 Char"/>
-    <w:basedOn w:val="DefaultParagraphFont"/>
-    <w:link w:val="Heading2"/>
+  <w:style w:type="character" w:customStyle="1" w:styleId="berschrift2Zchn">
+    <w:name w:val="Überschrift 2 Zchn"/>
+    <w:basedOn w:val="Absatz-Standardschriftart"/>
+    <w:link w:val="berschrift2"/>
     <w:uiPriority w:val="9"/>
     <w:semiHidden/>
     <w:rsid w:val="00E62764"/>
@@ -896,10 +2306,10 @@
       <w:szCs w:val="32"/>
     </w:rPr>
   </w:style>
-  <w:style w:type="character" w:customStyle="1" w:styleId="Heading3Char">
-    <w:name w:val="Heading 3 Char"/>
-    <w:basedOn w:val="DefaultParagraphFont"/>
-    <w:link w:val="Heading3"/>
+  <w:style w:type="character" w:customStyle="1" w:styleId="berschrift3Zchn">
+    <w:name w:val="Überschrift 3 Zchn"/>
+    <w:basedOn w:val="Absatz-Standardschriftart"/>
+    <w:link w:val="berschrift3"/>
     <w:uiPriority w:val="9"/>
     <w:semiHidden/>
     <w:rsid w:val="00E62764"/>
@@ -910,10 +2320,10 @@
       <w:szCs w:val="28"/>
     </w:rPr>
   </w:style>
-  <w:style w:type="character" w:customStyle="1" w:styleId="Heading4Char">
-    <w:name w:val="Heading 4 Char"/>
-    <w:basedOn w:val="DefaultParagraphFont"/>
-    <w:link w:val="Heading4"/>
+  <w:style w:type="character" w:customStyle="1" w:styleId="berschrift4Zchn">
+    <w:name w:val="Überschrift 4 Zchn"/>
+    <w:basedOn w:val="Absatz-Standardschriftart"/>
+    <w:link w:val="berschrift4"/>
     <w:uiPriority w:val="9"/>
     <w:semiHidden/>
     <w:rsid w:val="00E62764"/>
@@ -924,10 +2334,10 @@
       <w:color w:val="0F4761" w:themeColor="accent1" w:themeShade="BF"/>
     </w:rPr>
   </w:style>
-  <w:style w:type="character" w:customStyle="1" w:styleId="Heading5Char">
-    <w:name w:val="Heading 5 Char"/>
-    <w:basedOn w:val="DefaultParagraphFont"/>
-    <w:link w:val="Heading5"/>
+  <w:style w:type="character" w:customStyle="1" w:styleId="berschrift5Zchn">
+    <w:name w:val="Überschrift 5 Zchn"/>
+    <w:basedOn w:val="Absatz-Standardschriftart"/>
+    <w:link w:val="berschrift5"/>
     <w:uiPriority w:val="9"/>
     <w:semiHidden/>
     <w:rsid w:val="00E62764"/>
@@ -936,10 +2346,10 @@
       <w:color w:val="0F4761" w:themeColor="accent1" w:themeShade="BF"/>
     </w:rPr>
   </w:style>
-  <w:style w:type="character" w:customStyle="1" w:styleId="Heading6Char">
-    <w:name w:val="Heading 6 Char"/>
-    <w:basedOn w:val="DefaultParagraphFont"/>
-    <w:link w:val="Heading6"/>
+  <w:style w:type="character" w:customStyle="1" w:styleId="berschrift6Zchn">
+    <w:name w:val="Überschrift 6 Zchn"/>
+    <w:basedOn w:val="Absatz-Standardschriftart"/>
+    <w:link w:val="berschrift6"/>
     <w:uiPriority w:val="9"/>
     <w:semiHidden/>
     <w:rsid w:val="00E62764"/>
@@ -950,10 +2360,10 @@
       <w:color w:val="595959" w:themeColor="text1" w:themeTint="A6"/>
     </w:rPr>
   </w:style>
-  <w:style w:type="character" w:customStyle="1" w:styleId="Heading7Char">
-    <w:name w:val="Heading 7 Char"/>
-    <w:basedOn w:val="DefaultParagraphFont"/>
-    <w:link w:val="Heading7"/>
+  <w:style w:type="character" w:customStyle="1" w:styleId="berschrift7Zchn">
+    <w:name w:val="Überschrift 7 Zchn"/>
+    <w:basedOn w:val="Absatz-Standardschriftart"/>
+    <w:link w:val="berschrift7"/>
     <w:uiPriority w:val="9"/>
     <w:semiHidden/>
     <w:rsid w:val="00E62764"/>
@@ -962,10 +2372,10 @@
       <w:color w:val="595959" w:themeColor="text1" w:themeTint="A6"/>
     </w:rPr>
   </w:style>
-  <w:style w:type="character" w:customStyle="1" w:styleId="Heading8Char">
-    <w:name w:val="Heading 8 Char"/>
-    <w:basedOn w:val="DefaultParagraphFont"/>
-    <w:link w:val="Heading8"/>
+  <w:style w:type="character" w:customStyle="1" w:styleId="berschrift8Zchn">
+    <w:name w:val="Überschrift 8 Zchn"/>
+    <w:basedOn w:val="Absatz-Standardschriftart"/>
+    <w:link w:val="berschrift8"/>
     <w:uiPriority w:val="9"/>
     <w:semiHidden/>
     <w:rsid w:val="00E62764"/>
@@ -976,10 +2386,10 @@
       <w:color w:val="272727" w:themeColor="text1" w:themeTint="D8"/>
     </w:rPr>
   </w:style>
-  <w:style w:type="character" w:customStyle="1" w:styleId="Heading9Char">
-    <w:name w:val="Heading 9 Char"/>
-    <w:basedOn w:val="DefaultParagraphFont"/>
-    <w:link w:val="Heading9"/>
+  <w:style w:type="character" w:customStyle="1" w:styleId="berschrift9Zchn">
+    <w:name w:val="Überschrift 9 Zchn"/>
+    <w:basedOn w:val="Absatz-Standardschriftart"/>
+    <w:link w:val="berschrift9"/>
     <w:uiPriority w:val="9"/>
     <w:semiHidden/>
     <w:rsid w:val="00E62764"/>
@@ -988,11 +2398,11 @@
       <w:color w:val="272727" w:themeColor="text1" w:themeTint="D8"/>
     </w:rPr>
   </w:style>
-  <w:style w:type="paragraph" w:styleId="Title">
+  <w:style w:type="paragraph" w:styleId="Titel">
     <w:name w:val="Title"/>
-    <w:basedOn w:val="Normal"/>
-    <w:next w:val="Normal"/>
-    <w:link w:val="TitleChar"/>
+    <w:basedOn w:val="Standard"/>
+    <w:next w:val="Standard"/>
+    <w:link w:val="TitelZchn"/>
     <w:uiPriority w:val="10"/>
     <w:qFormat/>
     <w:rsid w:val="00E62764"/>
@@ -1008,10 +2418,10 @@
       <w:szCs w:val="56"/>
     </w:rPr>
   </w:style>
-  <w:style w:type="character" w:customStyle="1" w:styleId="TitleChar">
-    <w:name w:val="Title Char"/>
-    <w:basedOn w:val="DefaultParagraphFont"/>
-    <w:link w:val="Title"/>
+  <w:style w:type="character" w:customStyle="1" w:styleId="TitelZchn">
+    <w:name w:val="Titel Zchn"/>
+    <w:basedOn w:val="Absatz-Standardschriftart"/>
+    <w:link w:val="Titel"/>
     <w:uiPriority w:val="10"/>
     <w:rsid w:val="00E62764"/>
     <w:rPr>
@@ -1022,11 +2432,11 @@
       <w:szCs w:val="56"/>
     </w:rPr>
   </w:style>
-  <w:style w:type="paragraph" w:styleId="Subtitle">
+  <w:style w:type="paragraph" w:styleId="Untertitel">
     <w:name w:val="Subtitle"/>
-    <w:basedOn w:val="Normal"/>
-    <w:next w:val="Normal"/>
-    <w:link w:val="SubtitleChar"/>
+    <w:basedOn w:val="Standard"/>
+    <w:next w:val="Standard"/>
+    <w:link w:val="UntertitelZchn"/>
     <w:uiPriority w:val="11"/>
     <w:qFormat/>
     <w:rsid w:val="00E62764"/>
@@ -1043,10 +2453,10 @@
       <w:szCs w:val="28"/>
     </w:rPr>
   </w:style>
-  <w:style w:type="character" w:customStyle="1" w:styleId="SubtitleChar">
-    <w:name w:val="Subtitle Char"/>
-    <w:basedOn w:val="DefaultParagraphFont"/>
-    <w:link w:val="Subtitle"/>
+  <w:style w:type="character" w:customStyle="1" w:styleId="UntertitelZchn">
+    <w:name w:val="Untertitel Zchn"/>
+    <w:basedOn w:val="Absatz-Standardschriftart"/>
+    <w:link w:val="Untertitel"/>
     <w:uiPriority w:val="11"/>
     <w:rsid w:val="00E62764"/>
     <w:rPr>
@@ -1057,11 +2467,11 @@
       <w:szCs w:val="28"/>
     </w:rPr>
   </w:style>
-  <w:style w:type="paragraph" w:styleId="Quote">
+  <w:style w:type="paragraph" w:styleId="Zitat">
     <w:name w:val="Quote"/>
-    <w:basedOn w:val="Normal"/>
-    <w:next w:val="Normal"/>
-    <w:link w:val="QuoteChar"/>
+    <w:basedOn w:val="Standard"/>
+    <w:next w:val="Standard"/>
+    <w:link w:val="ZitatZchn"/>
     <w:uiPriority w:val="29"/>
     <w:qFormat/>
     <w:rsid w:val="00E62764"/>
@@ -1075,10 +2485,10 @@
       <w:color w:val="404040" w:themeColor="text1" w:themeTint="BF"/>
     </w:rPr>
   </w:style>
-  <w:style w:type="character" w:customStyle="1" w:styleId="QuoteChar">
-    <w:name w:val="Quote Char"/>
-    <w:basedOn w:val="DefaultParagraphFont"/>
-    <w:link w:val="Quote"/>
+  <w:style w:type="character" w:customStyle="1" w:styleId="ZitatZchn">
+    <w:name w:val="Zitat Zchn"/>
+    <w:basedOn w:val="Absatz-Standardschriftart"/>
+    <w:link w:val="Zitat"/>
     <w:uiPriority w:val="29"/>
     <w:rsid w:val="00E62764"/>
     <w:rPr>
@@ -1087,9 +2497,9 @@
       <w:color w:val="404040" w:themeColor="text1" w:themeTint="BF"/>
     </w:rPr>
   </w:style>
-  <w:style w:type="paragraph" w:styleId="ListParagraph">
+  <w:style w:type="paragraph" w:styleId="Listenabsatz">
     <w:name w:val="List Paragraph"/>
-    <w:basedOn w:val="Normal"/>
+    <w:basedOn w:val="Standard"/>
     <w:uiPriority w:val="34"/>
     <w:qFormat/>
     <w:rsid w:val="00E62764"/>
@@ -1098,9 +2508,9 @@
       <w:contextualSpacing/>
     </w:pPr>
   </w:style>
-  <w:style w:type="character" w:styleId="IntenseEmphasis">
+  <w:style w:type="character" w:styleId="IntensiveHervorhebung">
     <w:name w:val="Intense Emphasis"/>
-    <w:basedOn w:val="DefaultParagraphFont"/>
+    <w:basedOn w:val="Absatz-Standardschriftart"/>
     <w:uiPriority w:val="21"/>
     <w:qFormat/>
     <w:rsid w:val="00E62764"/>
@@ -1110,11 +2520,11 @@
       <w:color w:val="0F4761" w:themeColor="accent1" w:themeShade="BF"/>
     </w:rPr>
   </w:style>
-  <w:style w:type="paragraph" w:styleId="IntenseQuote">
+  <w:style w:type="paragraph" w:styleId="IntensivesZitat">
     <w:name w:val="Intense Quote"/>
-    <w:basedOn w:val="Normal"/>
-    <w:next w:val="Normal"/>
-    <w:link w:val="IntenseQuoteChar"/>
+    <w:basedOn w:val="Standard"/>
+    <w:next w:val="Standard"/>
+    <w:link w:val="IntensivesZitatZchn"/>
     <w:uiPriority w:val="30"/>
     <w:qFormat/>
     <w:rsid w:val="00E62764"/>
@@ -1133,10 +2543,10 @@
       <w:color w:val="0F4761" w:themeColor="accent1" w:themeShade="BF"/>
     </w:rPr>
   </w:style>
-  <w:style w:type="character" w:customStyle="1" w:styleId="IntenseQuoteChar">
-    <w:name w:val="Intense Quote Char"/>
-    <w:basedOn w:val="DefaultParagraphFont"/>
-    <w:link w:val="IntenseQuote"/>
+  <w:style w:type="character" w:customStyle="1" w:styleId="IntensivesZitatZchn">
+    <w:name w:val="Intensives Zitat Zchn"/>
+    <w:basedOn w:val="Absatz-Standardschriftart"/>
+    <w:link w:val="IntensivesZitat"/>
     <w:uiPriority w:val="30"/>
     <w:rsid w:val="00E62764"/>
     <w:rPr>
@@ -1145,9 +2555,9 @@
       <w:color w:val="0F4761" w:themeColor="accent1" w:themeShade="BF"/>
     </w:rPr>
   </w:style>
-  <w:style w:type="character" w:styleId="IntenseReference">
+  <w:style w:type="character" w:styleId="IntensiverVerweis">
     <w:name w:val="Intense Reference"/>
-    <w:basedOn w:val="DefaultParagraphFont"/>
+    <w:basedOn w:val="Absatz-Standardschriftart"/>
     <w:uiPriority w:val="32"/>
     <w:qFormat/>
     <w:rsid w:val="00E62764"/>
@@ -1159,9 +2569,9 @@
       <w:spacing w:val="5"/>
     </w:rPr>
   </w:style>
-  <w:style w:type="table" w:styleId="TableGrid">
+  <w:style w:type="table" w:styleId="Tabellenraster">
     <w:name w:val="Table Grid"/>
-    <w:basedOn w:val="TableNormal"/>
+    <w:basedOn w:val="NormaleTabelle"/>
     <w:uiPriority w:val="39"/>
     <w:rsid w:val="00634B28"/>
     <w:pPr>
@@ -1177,6 +2587,61 @@
         <w:insideV w:val="single" w:sz="4" w:space="0" w:color="auto"/>
       </w:tblBorders>
     </w:tblPr>
+  </w:style>
+  <w:style w:type="paragraph" w:styleId="StandardWeb">
+    <w:name w:val="Normal (Web)"/>
+    <w:basedOn w:val="Standard"/>
+    <w:uiPriority w:val="99"/>
+    <w:semiHidden/>
+    <w:unhideWhenUsed/>
+    <w:rsid w:val="00861AB3"/>
+    <w:rPr>
+      <w:rFonts w:ascii="Times New Roman" w:hAnsi="Times New Roman" w:cs="Times New Roman"/>
+    </w:rPr>
+  </w:style>
+  <w:style w:type="paragraph" w:styleId="Kopfzeile">
+    <w:name w:val="header"/>
+    <w:basedOn w:val="Standard"/>
+    <w:link w:val="KopfzeileZchn"/>
+    <w:uiPriority w:val="99"/>
+    <w:unhideWhenUsed/>
+    <w:rsid w:val="00861AB3"/>
+    <w:pPr>
+      <w:tabs>
+        <w:tab w:val="center" w:pos="4536"/>
+        <w:tab w:val="right" w:pos="9072"/>
+      </w:tabs>
+      <w:spacing w:after="0" w:line="240" w:lineRule="auto"/>
+    </w:pPr>
+  </w:style>
+  <w:style w:type="character" w:customStyle="1" w:styleId="KopfzeileZchn">
+    <w:name w:val="Kopfzeile Zchn"/>
+    <w:basedOn w:val="Absatz-Standardschriftart"/>
+    <w:link w:val="Kopfzeile"/>
+    <w:uiPriority w:val="99"/>
+    <w:rsid w:val="00861AB3"/>
+  </w:style>
+  <w:style w:type="paragraph" w:styleId="Fuzeile">
+    <w:name w:val="footer"/>
+    <w:basedOn w:val="Standard"/>
+    <w:link w:val="FuzeileZchn"/>
+    <w:uiPriority w:val="99"/>
+    <w:unhideWhenUsed/>
+    <w:rsid w:val="00861AB3"/>
+    <w:pPr>
+      <w:tabs>
+        <w:tab w:val="center" w:pos="4536"/>
+        <w:tab w:val="right" w:pos="9072"/>
+      </w:tabs>
+      <w:spacing w:after="0" w:line="240" w:lineRule="auto"/>
+    </w:pPr>
+  </w:style>
+  <w:style w:type="character" w:customStyle="1" w:styleId="FuzeileZchn">
+    <w:name w:val="Fußzeile Zchn"/>
+    <w:basedOn w:val="Absatz-Standardschriftart"/>
+    <w:link w:val="Fuzeile"/>
+    <w:uiPriority w:val="99"/>
+    <w:rsid w:val="00861AB3"/>
   </w:style>
 </w:styles>
 </file>

</xml_diff>